<commit_message>
feat: add individual diary and MVP details for Execução de Projetos 2
</commit_message>
<xml_diff>
--- a/disciplinas/execucao-de-projetos-2/2026/05/27/README.docx
+++ b/disciplinas/execucao-de-projetos-2/2026/05/27/README.docx
@@ -2,7 +2,7 @@
 <file path=word/document.xml><?xml version="1.0" encoding="utf-8"?>
 <w:document xmlns:w="http://schemas.openxmlformats.org/wordprocessingml/2006/main" xmlns:m="http://schemas.openxmlformats.org/officeDocument/2006/math" xmlns:r="http://schemas.openxmlformats.org/officeDocument/2006/relationships" xmlns:o="urn:schemas-microsoft-com:office:office" xmlns:v="urn:schemas-microsoft-com:vml" xmlns:w10="urn:schemas-microsoft-com:office:word" xmlns:a="http://schemas.openxmlformats.org/drawingml/2006/main" xmlns:pic="http://schemas.openxmlformats.org/drawingml/2006/picture" xmlns:wp="http://schemas.openxmlformats.org/drawingml/2006/wordprocessingDrawing">
   <w:body>
-    <w:bookmarkStart w:id="10" w:name="execução-de-projeto-2---2026-05-27"/>
+    <w:bookmarkStart w:id="16" w:name="execução-de-projeto-2---2026-05-27"/>
     <w:p>
       <w:pPr>
         <w:pStyle w:val="Heading1"/>
@@ -11,7 +11,7 @@
         <w:t xml:space="preserve">Execução de Projeto 2 - 2026-05-27</w:t>
       </w:r>
     </w:p>
-    <w:bookmarkStart w:id="9" w:name="X42affc9d3a5a3b072c561848db353da79f8c930"/>
+    <w:bookmarkStart w:id="15" w:name="X42affc9d3a5a3b072c561848db353da79f8c930"/>
     <w:p>
       <w:pPr>
         <w:pStyle w:val="Heading2"/>
@@ -283,8 +283,189 @@
         <w:t xml:space="preserve">Resultados de aprendizagem: melhorei a capacidade de diagnosticar problemas em bases de dados, a habilidade de traduzir requisitos de negócio em tarefas técnicas rastreáveis e a competência de mediar decisões técnicas em equipe. Essas ações contribuíram para entregas mais limpas, maior rastreabilidade e redução de retrabalho nas sprints seguintes.</w:t>
       </w:r>
     </w:p>
-    <w:bookmarkEnd w:id="9"/>
-    <w:bookmarkEnd w:id="10"/>
+    <w:p>
+      <w:r>
+        <w:pict>
+          <v:rect style="width:0;height:1.5pt" o:hralign="center" o:hrstd="t" o:hr="t"/>
+        </w:pict>
+      </w:r>
+    </w:p>
+    <w:p>
+      <w:pPr>
+        <w:pStyle w:val="FirstParagraph"/>
+      </w:pPr>
+      <w:r>
+        <w:t xml:space="preserve">Apresentação em vídeo:</w:t>
+      </w:r>
+    </w:p>
+    <w:p>
+      <w:pPr>
+        <w:pStyle w:val="BodyText"/>
+      </w:pPr>
+      <w:r>
+        <w:t xml:space="preserve">Youtube: https://www.youtube.com/watch?v=OztoN8UlzxA</w:t>
+      </w:r>
+    </w:p>
+    <w:p>
+      <w:pPr>
+        <w:pStyle w:val="BodyText"/>
+      </w:pPr>
+      <w:r>
+        <w:t xml:space="preserve">MVP:</w:t>
+      </w:r>
+    </w:p>
+    <w:p>
+      <w:pPr>
+        <w:pStyle w:val="BodyText"/>
+      </w:pPr>
+      <w:r>
+        <w:t xml:space="preserve">URL: http://35.158.190.88/</w:t>
+      </w:r>
+    </w:p>
+    <w:p>
+      <w:pPr>
+        <w:pStyle w:val="BodyText"/>
+      </w:pPr>
+      <w:r>
+        <w:t xml:space="preserve">Acessos:</w:t>
+      </w:r>
+    </w:p>
+    <w:p>
+      <w:pPr>
+        <w:pStyle w:val="BodyText"/>
+      </w:pPr>
+      <w:r>
+        <w:t xml:space="preserve">Email: admin@example.com | Password: Admin123!</w:t>
+      </w:r>
+    </w:p>
+    <w:p>
+      <w:pPr>
+        <w:pStyle w:val="BodyText"/>
+      </w:pPr>
+      <w:r>
+        <w:t xml:space="preserve">Email: test@example.com | Password: Password123!</w:t>
+      </w:r>
+    </w:p>
+    <w:p>
+      <w:pPr>
+        <w:pStyle w:val="BodyText"/>
+      </w:pPr>
+      <w:r>
+        <w:t xml:space="preserve">Prints:</w:t>
+      </w:r>
+    </w:p>
+    <w:p>
+      <w:pPr>
+        <w:pStyle w:val="CaptionedFigure"/>
+      </w:pPr>
+      <w:r>
+        <w:drawing>
+          <wp:inline>
+            <wp:extent cx="5334000" cy="3333750"/>
+            <wp:effectExtent b="0" l="0" r="0" t="0"/>
+            <wp:docPr descr="MVP" title="" id="10" name="Picture"/>
+            <a:graphic>
+              <a:graphicData uri="http://schemas.openxmlformats.org/drawingml/2006/picture">
+                <pic:pic>
+                  <pic:nvPicPr>
+                    <pic:cNvPr descr="./mvp.png" id="11" name="Picture"/>
+                    <pic:cNvPicPr>
+                      <a:picLocks noChangeArrowheads="1" noChangeAspect="1"/>
+                    </pic:cNvPicPr>
+                  </pic:nvPicPr>
+                  <pic:blipFill>
+                    <a:blip r:embed="rId9"/>
+                    <a:stretch>
+                      <a:fillRect/>
+                    </a:stretch>
+                  </pic:blipFill>
+                  <pic:spPr bwMode="auto">
+                    <a:xfrm>
+                      <a:off x="0" y="0"/>
+                      <a:ext cx="5334000" cy="3333750"/>
+                    </a:xfrm>
+                    <a:prstGeom prst="rect">
+                      <a:avLst/>
+                    </a:prstGeom>
+                    <a:noFill/>
+                    <a:ln w="9525">
+                      <a:noFill/>
+                      <a:headEnd/>
+                      <a:tailEnd/>
+                    </a:ln>
+                  </pic:spPr>
+                </pic:pic>
+              </a:graphicData>
+            </a:graphic>
+          </wp:inline>
+        </w:drawing>
+      </w:r>
+    </w:p>
+    <w:p>
+      <w:pPr>
+        <w:pStyle w:val="ImageCaption"/>
+      </w:pPr>
+      <w:r>
+        <w:t xml:space="preserve">MVP</w:t>
+      </w:r>
+    </w:p>
+    <w:p>
+      <w:pPr>
+        <w:pStyle w:val="CaptionedFigure"/>
+      </w:pPr>
+      <w:r>
+        <w:drawing>
+          <wp:inline>
+            <wp:extent cx="5334000" cy="3333750"/>
+            <wp:effectExtent b="0" l="0" r="0" t="0"/>
+            <wp:docPr descr="e-mail" title="" id="13" name="Picture"/>
+            <a:graphic>
+              <a:graphicData uri="http://schemas.openxmlformats.org/drawingml/2006/picture">
+                <pic:pic>
+                  <pic:nvPicPr>
+                    <pic:cNvPr descr="./email.png" id="14" name="Picture"/>
+                    <pic:cNvPicPr>
+                      <a:picLocks noChangeArrowheads="1" noChangeAspect="1"/>
+                    </pic:cNvPicPr>
+                  </pic:nvPicPr>
+                  <pic:blipFill>
+                    <a:blip r:embed="rId12"/>
+                    <a:stretch>
+                      <a:fillRect/>
+                    </a:stretch>
+                  </pic:blipFill>
+                  <pic:spPr bwMode="auto">
+                    <a:xfrm>
+                      <a:off x="0" y="0"/>
+                      <a:ext cx="5334000" cy="3333750"/>
+                    </a:xfrm>
+                    <a:prstGeom prst="rect">
+                      <a:avLst/>
+                    </a:prstGeom>
+                    <a:noFill/>
+                    <a:ln w="9525">
+                      <a:noFill/>
+                      <a:headEnd/>
+                      <a:tailEnd/>
+                    </a:ln>
+                  </pic:spPr>
+                </pic:pic>
+              </a:graphicData>
+            </a:graphic>
+          </wp:inline>
+        </w:drawing>
+      </w:r>
+    </w:p>
+    <w:p>
+      <w:pPr>
+        <w:pStyle w:val="ImageCaption"/>
+      </w:pPr>
+      <w:r>
+        <w:t xml:space="preserve">e-mail</w:t>
+      </w:r>
+    </w:p>
+    <w:bookmarkEnd w:id="15"/>
+    <w:bookmarkEnd w:id="16"/>
     <w:sectPr>
       <w:footnotePr>
         <w:numRestart w:val="eachSect"/>

</xml_diff>